<commit_message>
More edits to EmbedDLL_C2_Dropper-Loader_FINAL_DEFANGED.docx
</commit_message>
<xml_diff>
--- a/EmbedDLL_C2_Dropper-Loader_FINAL_DEFANGED.docx
+++ b/EmbedDLL_C2_Dropper-Loader_FINAL_DEFANGED.docx
@@ -166,8 +166,9 @@
           <w:sz w:val="44"/>
           <w:szCs w:val="44"/>
         </w:rPr>
-        <w:t>C2</w:t>
-      </w:r>
+        <w:t>C</w:t>
+      </w:r>
+      <w:proofErr w:type="gramStart"/>
       <w:r>
         <w:rPr>
           <w:rFonts w:ascii="Montserrat Medium" w:hAnsi="Montserrat Medium" w:cs="Times New Roman"/>
@@ -176,7 +177,7 @@
           <w:sz w:val="44"/>
           <w:szCs w:val="44"/>
         </w:rPr>
-        <w:t>.</w:t>
+        <w:t>2</w:t>
       </w:r>
       <w:r>
         <w:rPr>
@@ -186,7 +187,7 @@
           <w:sz w:val="44"/>
           <w:szCs w:val="44"/>
         </w:rPr>
-        <w:t>Bootstrap</w:t>
+        <w:t>.</w:t>
       </w:r>
       <w:r>
         <w:rPr>
@@ -196,7 +197,7 @@
           <w:sz w:val="44"/>
           <w:szCs w:val="44"/>
         </w:rPr>
-        <w:t>.</w:t>
+        <w:t>Bootstrap</w:t>
       </w:r>
       <w:r>
         <w:rPr>
@@ -206,7 +207,7 @@
           <w:sz w:val="44"/>
           <w:szCs w:val="44"/>
         </w:rPr>
-        <w:t>Dropper</w:t>
+        <w:t>.</w:t>
       </w:r>
       <w:r>
         <w:rPr>
@@ -216,8 +217,9 @@
           <w:sz w:val="44"/>
           <w:szCs w:val="44"/>
         </w:rPr>
-        <w:t>.</w:t>
-      </w:r>
+        <w:t>Dropper</w:t>
+      </w:r>
+      <w:proofErr w:type="gramEnd"/>
       <w:r>
         <w:rPr>
           <w:rFonts w:ascii="Montserrat Medium" w:hAnsi="Montserrat Medium" w:cs="Times New Roman"/>
@@ -226,13 +228,9 @@
           <w:sz w:val="44"/>
           <w:szCs w:val="44"/>
         </w:rPr>
-        <w:t>Loader</w:t>
-      </w:r>
-    </w:p>
-    <w:p>
-      <w:pPr>
-        <w:spacing w:after="160" w:line="259" w:lineRule="auto"/>
-        <w:jc w:val="center"/>
+        <w:t>.</w:t>
+      </w:r>
+      <w:r>
         <w:rPr>
           <w:rFonts w:ascii="Montserrat Medium" w:hAnsi="Montserrat Medium" w:cs="Times New Roman"/>
           <w:bCs/>
@@ -240,7 +238,8 @@
           <w:sz w:val="44"/>
           <w:szCs w:val="44"/>
         </w:rPr>
-      </w:pPr>
+        <w:t>Loader</w:t>
+      </w:r>
     </w:p>
     <w:p>
       <w:pPr>
@@ -250,6 +249,8 @@
           <w:rFonts w:ascii="Montserrat Medium" w:hAnsi="Montserrat Medium" w:cs="Times New Roman"/>
           <w:bCs/>
           <w:color w:val="004E76"/>
+          <w:sz w:val="44"/>
+          <w:szCs w:val="44"/>
         </w:rPr>
       </w:pPr>
     </w:p>
@@ -263,21 +264,24 @@
           <w:color w:val="004E76"/>
         </w:rPr>
       </w:pPr>
-      <w:r>
+    </w:p>
+    <w:p>
+      <w:pPr>
+        <w:spacing w:after="160" w:line="259" w:lineRule="auto"/>
+        <w:jc w:val="center"/>
         <w:rPr>
           <w:rFonts w:ascii="Montserrat Medium" w:hAnsi="Montserrat Medium" w:cs="Times New Roman"/>
           <w:bCs/>
           <w:color w:val="004E76"/>
         </w:rPr>
-        <w:t>January 2,</w:t>
-      </w:r>
+      </w:pPr>
       <w:r>
         <w:rPr>
           <w:rFonts w:ascii="Montserrat Medium" w:hAnsi="Montserrat Medium" w:cs="Times New Roman"/>
           <w:bCs/>
           <w:color w:val="004E76"/>
         </w:rPr>
-        <w:t xml:space="preserve"> 202</w:t>
+        <w:t>January 2,</w:t>
       </w:r>
       <w:r>
         <w:rPr>
@@ -285,8 +289,26 @@
           <w:bCs/>
           <w:color w:val="004E76"/>
         </w:rPr>
+        <w:t xml:space="preserve"> </w:t>
+      </w:r>
+      <w:proofErr w:type="gramStart"/>
+      <w:r>
+        <w:rPr>
+          <w:rFonts w:ascii="Montserrat Medium" w:hAnsi="Montserrat Medium" w:cs="Times New Roman"/>
+          <w:bCs/>
+          <w:color w:val="004E76"/>
+        </w:rPr>
+        <w:t>202</w:t>
+      </w:r>
+      <w:r>
+        <w:rPr>
+          <w:rFonts w:ascii="Montserrat Medium" w:hAnsi="Montserrat Medium" w:cs="Times New Roman"/>
+          <w:bCs/>
+          <w:color w:val="004E76"/>
+        </w:rPr>
         <w:t>6</w:t>
       </w:r>
+      <w:proofErr w:type="gramEnd"/>
       <w:r>
         <w:rPr>
           <w:rFonts w:ascii="Montserrat Medium" w:hAnsi="Montserrat Medium" w:cs="Times New Roman"/>
@@ -3250,7 +3272,21 @@
         <w:rPr>
           <w:rFonts w:ascii="Montserrat Medium" w:hAnsi="Montserrat Medium"/>
         </w:rPr>
-        <w:t xml:space="preserve"> loader that deploys a secondary payload using DLL reflection and Living-off-the-Land binaries. The malware is designed to evade static detection through AES-encrypted embedded resources and reflective assembly loading. Persistence is achieved via registry Run keys and execution is proxied through MSBuild.</w:t>
+        <w:t xml:space="preserve"> </w:t>
+      </w:r>
+      <w:proofErr w:type="gramStart"/>
+      <w:r>
+        <w:rPr>
+          <w:rFonts w:ascii="Montserrat Medium" w:hAnsi="Montserrat Medium"/>
+        </w:rPr>
+        <w:t>loader</w:t>
+      </w:r>
+      <w:proofErr w:type="gramEnd"/>
+      <w:r>
+        <w:rPr>
+          <w:rFonts w:ascii="Montserrat Medium" w:hAnsi="Montserrat Medium"/>
+        </w:rPr>
+        <w:t xml:space="preserve"> that deploys a secondary payload using DLL reflection and Living-off-the-Land binaries. The malware is designed to evade static detection through AES-encrypted embedded resources and reflective assembly loading. Persistence is achieved via registry Run keys and execution is proxied through MSBuild.</w:t>
       </w:r>
       <w:r>
         <w:rPr>
@@ -3487,8 +3523,17 @@
           <w:rFonts w:ascii="Montserrat Medium" w:hAnsi="Montserrat Medium"/>
           <w:szCs w:val="24"/>
         </w:rPr>
-        <w:t>To analyze the managed .NET DLL (Malware.cryptlib64.dll), a controlled execution environment was established. The DLL requires a hosting process, as it contains managed code entry points that cannot execute</w:t>
-      </w:r>
+        <w:t xml:space="preserve">To analyze the managed .NET DLL (Malware.cryptlib64.dll), a controlled execution environment was established. The DLL requires a hosting process, as it contains managed code entry points that cannot </w:t>
+      </w:r>
+      <w:proofErr w:type="gramStart"/>
+      <w:r>
+        <w:rPr>
+          <w:rFonts w:ascii="Montserrat Medium" w:hAnsi="Montserrat Medium"/>
+          <w:szCs w:val="24"/>
+        </w:rPr>
+        <w:t>execute</w:t>
+      </w:r>
+      <w:proofErr w:type="gramEnd"/>
       <w:r>
         <w:rPr>
           <w:rFonts w:ascii="Montserrat Medium" w:hAnsi="Montserrat Medium"/>
@@ -3642,7 +3687,64 @@
           <w:rFonts w:ascii="Montserrat Medium" w:hAnsi="Montserrat Medium"/>
           <w:szCs w:val="24"/>
         </w:rPr>
-        <w:t>Loading Mechanism: Using .NET Reflection APIs Assembly[.]LoadFile(), MethodInfo[.]Invoke()</w:t>
+        <w:t>Loading Mechanism: Using .NET Reflection APIs Assembly[.]</w:t>
+      </w:r>
+      <w:proofErr w:type="spellStart"/>
+      <w:proofErr w:type="gramStart"/>
+      <w:r>
+        <w:rPr>
+          <w:rFonts w:ascii="Montserrat Medium" w:hAnsi="Montserrat Medium"/>
+          <w:szCs w:val="24"/>
+        </w:rPr>
+        <w:t>LoadFile</w:t>
+      </w:r>
+      <w:proofErr w:type="spellEnd"/>
+      <w:r>
+        <w:rPr>
+          <w:rFonts w:ascii="Montserrat Medium" w:hAnsi="Montserrat Medium"/>
+          <w:szCs w:val="24"/>
+        </w:rPr>
+        <w:t>(</w:t>
+      </w:r>
+      <w:proofErr w:type="gramEnd"/>
+      <w:r>
+        <w:rPr>
+          <w:rFonts w:ascii="Montserrat Medium" w:hAnsi="Montserrat Medium"/>
+          <w:szCs w:val="24"/>
+        </w:rPr>
+        <w:t xml:space="preserve">), </w:t>
+      </w:r>
+      <w:proofErr w:type="spellStart"/>
+      <w:r>
+        <w:rPr>
+          <w:rFonts w:ascii="Montserrat Medium" w:hAnsi="Montserrat Medium"/>
+          <w:szCs w:val="24"/>
+        </w:rPr>
+        <w:t>MethodInfo</w:t>
+      </w:r>
+      <w:proofErr w:type="spellEnd"/>
+      <w:r>
+        <w:rPr>
+          <w:rFonts w:ascii="Montserrat Medium" w:hAnsi="Montserrat Medium"/>
+          <w:szCs w:val="24"/>
+        </w:rPr>
+        <w:t>[.]</w:t>
+      </w:r>
+      <w:proofErr w:type="gramStart"/>
+      <w:r>
+        <w:rPr>
+          <w:rFonts w:ascii="Montserrat Medium" w:hAnsi="Montserrat Medium"/>
+          <w:szCs w:val="24"/>
+        </w:rPr>
+        <w:t>Invoke(</w:t>
+      </w:r>
+      <w:proofErr w:type="gramEnd"/>
+      <w:r>
+        <w:rPr>
+          <w:rFonts w:ascii="Montserrat Medium" w:hAnsi="Montserrat Medium"/>
+          <w:szCs w:val="24"/>
+        </w:rPr>
+        <w:t>)</w:t>
       </w:r>
     </w:p>
     <w:p>
@@ -3663,7 +3765,23 @@
           <w:rFonts w:ascii="Montserrat Medium" w:hAnsi="Montserrat Medium"/>
           <w:szCs w:val="24"/>
         </w:rPr>
-        <w:t>Entry Point: Calling EmbedDLL[.]Program[.]embed() method</w:t>
+        <w:t>Entry Point: Calling EmbedDLL[.]Program[.]</w:t>
+      </w:r>
+      <w:proofErr w:type="gramStart"/>
+      <w:r>
+        <w:rPr>
+          <w:rFonts w:ascii="Montserrat Medium" w:hAnsi="Montserrat Medium"/>
+          <w:szCs w:val="24"/>
+        </w:rPr>
+        <w:t>embed(</w:t>
+      </w:r>
+      <w:proofErr w:type="gramEnd"/>
+      <w:r>
+        <w:rPr>
+          <w:rFonts w:ascii="Montserrat Medium" w:hAnsi="Montserrat Medium"/>
+          <w:szCs w:val="24"/>
+        </w:rPr>
+        <w:t>) method</w:t>
       </w:r>
     </w:p>
     <w:p>
@@ -4127,7 +4245,23 @@
           <w:rFonts w:ascii="Montserrat Medium" w:hAnsi="Montserrat Medium"/>
           <w:szCs w:val="24"/>
         </w:rPr>
-        <w:t>All findings reflect the DLL's capabilities when properly loaded</w:t>
+        <w:t xml:space="preserve">All findings reflect </w:t>
+      </w:r>
+      <w:proofErr w:type="gramStart"/>
+      <w:r>
+        <w:rPr>
+          <w:rFonts w:ascii="Montserrat Medium" w:hAnsi="Montserrat Medium"/>
+          <w:szCs w:val="24"/>
+        </w:rPr>
+        <w:t>the DLL's</w:t>
+      </w:r>
+      <w:proofErr w:type="gramEnd"/>
+      <w:r>
+        <w:rPr>
+          <w:rFonts w:ascii="Montserrat Medium" w:hAnsi="Montserrat Medium"/>
+          <w:szCs w:val="24"/>
+        </w:rPr>
+        <w:t xml:space="preserve"> capabilities when properly loaded</w:t>
       </w:r>
       <w:r>
         <w:rPr>
@@ -4481,7 +4615,7 @@
           <w:noProof/>
         </w:rPr>
         <w:drawing>
-          <wp:inline distT="0" distB="0" distL="0" distR="0" wp14:anchorId="78FA3533" wp14:editId="30247123">
+          <wp:inline distT="0" distB="0" distL="0" distR="0" wp14:anchorId="78FA3533" wp14:editId="1648BA36">
             <wp:extent cx="5064125" cy="8229600"/>
             <wp:effectExtent l="0" t="0" r="3175" b="0"/>
             <wp:docPr id="800585426" name="Picture 4"/>
@@ -5278,13 +5412,23 @@
         </w:rPr>
         <w:t xml:space="preserve">The XML payload is dropped in </w:t>
       </w:r>
+      <w:proofErr w:type="gramStart"/>
       <w:r>
         <w:rPr>
           <w:rFonts w:ascii="Montserrat Medium" w:hAnsi="Montserrat Medium"/>
           <w:i/>
           <w:iCs/>
         </w:rPr>
-        <w:t>Public user folder</w:t>
+        <w:t>Public</w:t>
+      </w:r>
+      <w:proofErr w:type="gramEnd"/>
+      <w:r>
+        <w:rPr>
+          <w:rFonts w:ascii="Montserrat Medium" w:hAnsi="Montserrat Medium"/>
+          <w:i/>
+          <w:iCs/>
+        </w:rPr>
+        <w:t xml:space="preserve"> user folder</w:t>
       </w:r>
     </w:p>
     <w:p>
@@ -5982,13 +6126,23 @@
           <w:iCs/>
         </w:rPr>
       </w:pPr>
+      <w:proofErr w:type="gramStart"/>
       <w:r>
         <w:rPr>
           <w:rFonts w:ascii="Montserrat Medium" w:hAnsi="Montserrat Medium"/>
           <w:i/>
           <w:iCs/>
         </w:rPr>
-        <w:t>Figure : H</w:t>
+        <w:t>Figure :</w:t>
+      </w:r>
+      <w:proofErr w:type="gramEnd"/>
+      <w:r>
+        <w:rPr>
+          <w:rFonts w:ascii="Montserrat Medium" w:hAnsi="Montserrat Medium"/>
+          <w:i/>
+          <w:iCs/>
+        </w:rPr>
+        <w:t xml:space="preserve"> H</w:t>
       </w:r>
       <w:r>
         <w:rPr>
@@ -6058,13 +6212,23 @@
           <w:iCs/>
         </w:rPr>
       </w:pPr>
+      <w:proofErr w:type="gramStart"/>
       <w:r>
         <w:rPr>
           <w:rFonts w:ascii="Montserrat Medium" w:hAnsi="Montserrat Medium"/>
           <w:i/>
           <w:iCs/>
         </w:rPr>
-        <w:t xml:space="preserve">Figure : </w:t>
+        <w:t>Figure :</w:t>
+      </w:r>
+      <w:proofErr w:type="gramEnd"/>
+      <w:r>
+        <w:rPr>
+          <w:rFonts w:ascii="Montserrat Medium" w:hAnsi="Montserrat Medium"/>
+          <w:i/>
+          <w:iCs/>
+        </w:rPr>
+        <w:t xml:space="preserve"> </w:t>
       </w:r>
       <w:r>
         <w:rPr>
@@ -6489,12 +6653,14 @@
           <w:rFonts w:ascii="Montserrat Medium" w:hAnsi="Montserrat Medium"/>
         </w:rPr>
       </w:pPr>
+      <w:proofErr w:type="gramStart"/>
       <w:r>
         <w:rPr>
           <w:rFonts w:ascii="Montserrat Medium" w:hAnsi="Montserrat Medium"/>
         </w:rPr>
         <w:t>System.Security.Cryptography</w:t>
       </w:r>
+      <w:proofErr w:type="gramEnd"/>
     </w:p>
     <w:p>
       <w:pPr>
@@ -7670,7 +7836,27 @@
           <w:color w:val="auto"/>
           <w:szCs w:val="24"/>
         </w:rPr>
-        <w:t>User-Agent: Mozilla/5.0 (Windows NT 6.1)…Chrome/41.0…</w:t>
+        <w:t xml:space="preserve">User-Agent: Mozilla/5.0 (Windows NT </w:t>
+      </w:r>
+      <w:proofErr w:type="gramStart"/>
+      <w:r>
+        <w:rPr>
+          <w:rFonts w:ascii="Montserrat Medium" w:eastAsiaTheme="majorEastAsia" w:hAnsi="Montserrat Medium" w:cstheme="majorBidi"/>
+          <w:bCs/>
+          <w:color w:val="auto"/>
+          <w:szCs w:val="24"/>
+        </w:rPr>
+        <w:t>6.1)…</w:t>
+      </w:r>
+      <w:proofErr w:type="gramEnd"/>
+      <w:r>
+        <w:rPr>
+          <w:rFonts w:ascii="Montserrat Medium" w:eastAsiaTheme="majorEastAsia" w:hAnsi="Montserrat Medium" w:cstheme="majorBidi"/>
+          <w:bCs/>
+          <w:color w:val="auto"/>
+          <w:szCs w:val="24"/>
+        </w:rPr>
+        <w:t>Chrome/41.0…</w:t>
       </w:r>
     </w:p>
     <w:p>
@@ -7743,7 +7929,87 @@
           <w:color w:val="auto"/>
           <w:szCs w:val="24"/>
         </w:rPr>
-        <w:t>{"GUID":"{0}","Type":{1},"Meta":"{2}","IV":"{3}",</w:t>
+        <w:t>{"GUID"</w:t>
+      </w:r>
+      <w:proofErr w:type="gramStart"/>
+      <w:r>
+        <w:rPr>
+          <w:rFonts w:ascii="Montserrat Medium" w:eastAsiaTheme="majorEastAsia" w:hAnsi="Montserrat Medium" w:cstheme="majorBidi"/>
+          <w:bCs/>
+          <w:color w:val="auto"/>
+          <w:szCs w:val="24"/>
+        </w:rPr>
+        <w:t>:"{0}"</w:t>
+      </w:r>
+      <w:proofErr w:type="gramEnd"/>
+      <w:r>
+        <w:rPr>
+          <w:rFonts w:ascii="Montserrat Medium" w:eastAsiaTheme="majorEastAsia" w:hAnsi="Montserrat Medium" w:cstheme="majorBidi"/>
+          <w:bCs/>
+          <w:color w:val="auto"/>
+          <w:szCs w:val="24"/>
+        </w:rPr>
+        <w:t>,"Type</w:t>
+      </w:r>
+      <w:proofErr w:type="gramStart"/>
+      <w:r>
+        <w:rPr>
+          <w:rFonts w:ascii="Montserrat Medium" w:eastAsiaTheme="majorEastAsia" w:hAnsi="Montserrat Medium" w:cstheme="majorBidi"/>
+          <w:bCs/>
+          <w:color w:val="auto"/>
+          <w:szCs w:val="24"/>
+        </w:rPr>
+        <w:t>":{1},</w:t>
+      </w:r>
+      <w:proofErr w:type="gramEnd"/>
+      <w:r>
+        <w:rPr>
+          <w:rFonts w:ascii="Montserrat Medium" w:eastAsiaTheme="majorEastAsia" w:hAnsi="Montserrat Medium" w:cstheme="majorBidi"/>
+          <w:bCs/>
+          <w:color w:val="auto"/>
+          <w:szCs w:val="24"/>
+        </w:rPr>
+        <w:t>"Meta"</w:t>
+      </w:r>
+      <w:proofErr w:type="gramStart"/>
+      <w:r>
+        <w:rPr>
+          <w:rFonts w:ascii="Montserrat Medium" w:eastAsiaTheme="majorEastAsia" w:hAnsi="Montserrat Medium" w:cstheme="majorBidi"/>
+          <w:bCs/>
+          <w:color w:val="auto"/>
+          <w:szCs w:val="24"/>
+        </w:rPr>
+        <w:t>:"{2}"</w:t>
+      </w:r>
+      <w:proofErr w:type="gramEnd"/>
+      <w:r>
+        <w:rPr>
+          <w:rFonts w:ascii="Montserrat Medium" w:eastAsiaTheme="majorEastAsia" w:hAnsi="Montserrat Medium" w:cstheme="majorBidi"/>
+          <w:bCs/>
+          <w:color w:val="auto"/>
+          <w:szCs w:val="24"/>
+        </w:rPr>
+        <w:t>,"IV"</w:t>
+      </w:r>
+      <w:proofErr w:type="gramStart"/>
+      <w:r>
+        <w:rPr>
+          <w:rFonts w:ascii="Montserrat Medium" w:eastAsiaTheme="majorEastAsia" w:hAnsi="Montserrat Medium" w:cstheme="majorBidi"/>
+          <w:bCs/>
+          <w:color w:val="auto"/>
+          <w:szCs w:val="24"/>
+        </w:rPr>
+        <w:t>:"{3}"</w:t>
+      </w:r>
+      <w:proofErr w:type="gramEnd"/>
+      <w:r>
+        <w:rPr>
+          <w:rFonts w:ascii="Montserrat Medium" w:eastAsiaTheme="majorEastAsia" w:hAnsi="Montserrat Medium" w:cstheme="majorBidi"/>
+          <w:bCs/>
+          <w:color w:val="auto"/>
+          <w:szCs w:val="24"/>
+        </w:rPr>
+        <w:t>,</w:t>
       </w:r>
     </w:p>
     <w:p>
@@ -7768,8 +8034,39 @@
           <w:color w:val="auto"/>
           <w:szCs w:val="24"/>
         </w:rPr>
-        <w:t>"EncryptedMessage":"{4}","HMAC":"{5}"}</w:t>
-      </w:r>
+        <w:t>"EncryptedMessage"</w:t>
+      </w:r>
+      <w:proofErr w:type="gramStart"/>
+      <w:r>
+        <w:rPr>
+          <w:rFonts w:ascii="Montserrat Medium" w:eastAsiaTheme="majorEastAsia" w:hAnsi="Montserrat Medium" w:cstheme="majorBidi"/>
+          <w:bCs/>
+          <w:color w:val="auto"/>
+          <w:szCs w:val="24"/>
+        </w:rPr>
+        <w:t>:"{4}"</w:t>
+      </w:r>
+      <w:proofErr w:type="gramEnd"/>
+      <w:r>
+        <w:rPr>
+          <w:rFonts w:ascii="Montserrat Medium" w:eastAsiaTheme="majorEastAsia" w:hAnsi="Montserrat Medium" w:cstheme="majorBidi"/>
+          <w:bCs/>
+          <w:color w:val="auto"/>
+          <w:szCs w:val="24"/>
+        </w:rPr>
+        <w:t>,"HMAC"</w:t>
+      </w:r>
+      <w:proofErr w:type="gramStart"/>
+      <w:r>
+        <w:rPr>
+          <w:rFonts w:ascii="Montserrat Medium" w:eastAsiaTheme="majorEastAsia" w:hAnsi="Montserrat Medium" w:cstheme="majorBidi"/>
+          <w:bCs/>
+          <w:color w:val="auto"/>
+          <w:szCs w:val="24"/>
+        </w:rPr>
+        <w:t>:"{5}"}</w:t>
+      </w:r>
+      <w:proofErr w:type="gramEnd"/>
     </w:p>
     <w:p>
       <w:pPr>
@@ -7994,43 +8291,6 @@
           <w:szCs w:val="28"/>
         </w:rPr>
       </w:pPr>
-    </w:p>
-    <w:p>
-      <w:pPr>
-        <w:pStyle w:val="Heading2"/>
-        <w:rPr>
-          <w:sz w:val="28"/>
-          <w:szCs w:val="28"/>
-        </w:rPr>
-      </w:pPr>
-      <w:r>
-        <w:rPr>
-          <w:sz w:val="28"/>
-          <w:szCs w:val="28"/>
-        </w:rPr>
-        <w:t xml:space="preserve">Stage 4: </w:t>
-      </w:r>
-      <w:r>
-        <w:rPr>
-          <w:sz w:val="28"/>
-          <w:szCs w:val="28"/>
-        </w:rPr>
-        <w:t xml:space="preserve">Final </w:t>
-      </w:r>
-      <w:r>
-        <w:rPr>
-          <w:sz w:val="28"/>
-          <w:szCs w:val="28"/>
-        </w:rPr>
-        <w:t xml:space="preserve">Covenant </w:t>
-      </w:r>
-      <w:r>
-        <w:rPr>
-          <w:sz w:val="28"/>
-          <w:szCs w:val="28"/>
-        </w:rPr>
-        <w:t>Implant</w:t>
-      </w:r>
     </w:p>
     <w:p>
       <w:pPr>
@@ -8360,13 +8620,23 @@
           <w:iCs/>
         </w:rPr>
       </w:pPr>
+      <w:proofErr w:type="gramStart"/>
       <w:r>
         <w:rPr>
           <w:rFonts w:ascii="Montserrat Medium" w:hAnsi="Montserrat Medium"/>
           <w:i/>
           <w:iCs/>
         </w:rPr>
-        <w:t xml:space="preserve">Figure : ProcMon shows files </w:t>
+        <w:t>Figure :</w:t>
+      </w:r>
+      <w:proofErr w:type="gramEnd"/>
+      <w:r>
+        <w:rPr>
+          <w:rFonts w:ascii="Montserrat Medium" w:hAnsi="Montserrat Medium"/>
+          <w:i/>
+          <w:iCs/>
+        </w:rPr>
+        <w:t xml:space="preserve"> ProcMon shows files </w:t>
       </w:r>
       <w:r>
         <w:rPr>
@@ -8457,13 +8727,23 @@
           <w:iCs/>
         </w:rPr>
       </w:pPr>
+      <w:proofErr w:type="gramStart"/>
       <w:r>
         <w:rPr>
           <w:rFonts w:ascii="Montserrat Medium" w:hAnsi="Montserrat Medium"/>
           <w:i/>
           <w:iCs/>
         </w:rPr>
-        <w:t>Figure : Persistence registry key created after initial EmbedDLL.dll execution</w:t>
+        <w:t>Figure :</w:t>
+      </w:r>
+      <w:proofErr w:type="gramEnd"/>
+      <w:r>
+        <w:rPr>
+          <w:rFonts w:ascii="Montserrat Medium" w:hAnsi="Montserrat Medium"/>
+          <w:i/>
+          <w:iCs/>
+        </w:rPr>
+        <w:t xml:space="preserve"> Persistence registry key created after initial EmbedDLL.dll execution</w:t>
       </w:r>
     </w:p>
     <w:p>
@@ -8533,13 +8813,23 @@
           <w:iCs/>
         </w:rPr>
       </w:pPr>
+      <w:proofErr w:type="gramStart"/>
       <w:r>
         <w:rPr>
           <w:rFonts w:ascii="Montserrat Medium" w:hAnsi="Montserrat Medium"/>
           <w:i/>
           <w:iCs/>
         </w:rPr>
-        <w:t>Figure : Wireshark packet capture showing HTTP call to C2 server</w:t>
+        <w:t>Figure :</w:t>
+      </w:r>
+      <w:proofErr w:type="gramEnd"/>
+      <w:r>
+        <w:rPr>
+          <w:rFonts w:ascii="Montserrat Medium" w:hAnsi="Montserrat Medium"/>
+          <w:i/>
+          <w:iCs/>
+        </w:rPr>
+        <w:t xml:space="preserve"> Wireshark packet capture showing HTTP call to C2 server</w:t>
       </w:r>
     </w:p>
     <w:p>
@@ -8609,13 +8899,23 @@
           <w:iCs/>
         </w:rPr>
       </w:pPr>
+      <w:proofErr w:type="gramStart"/>
       <w:r>
         <w:rPr>
           <w:rFonts w:ascii="Montserrat Medium" w:hAnsi="Montserrat Medium"/>
           <w:i/>
           <w:iCs/>
         </w:rPr>
-        <w:t>Figure : Successful request on port 80</w:t>
+        <w:t>Figure :</w:t>
+      </w:r>
+      <w:proofErr w:type="gramEnd"/>
+      <w:r>
+        <w:rPr>
+          <w:rFonts w:ascii="Montserrat Medium" w:hAnsi="Montserrat Medium"/>
+          <w:i/>
+          <w:iCs/>
+        </w:rPr>
+        <w:t xml:space="preserve"> Successful request on port 80</w:t>
       </w:r>
     </w:p>
     <w:p>
@@ -8882,21 +9182,49 @@
           <w:iCs/>
         </w:rPr>
       </w:pPr>
+      <w:proofErr w:type="gramStart"/>
       <w:r>
         <w:rPr>
           <w:rFonts w:ascii="Montserrat Medium" w:hAnsi="Montserrat Medium"/>
           <w:i/>
           <w:iCs/>
         </w:rPr>
-        <w:t xml:space="preserve">Figure : </w:t>
-      </w:r>
+        <w:t>Figure :</w:t>
+      </w:r>
+      <w:proofErr w:type="gramEnd"/>
       <w:r>
         <w:rPr>
           <w:rFonts w:ascii="Montserrat Medium" w:hAnsi="Montserrat Medium"/>
           <w:i/>
           <w:iCs/>
         </w:rPr>
-        <w:t xml:space="preserve">XML arguments for embed[.]vbs to </w:t>
+        <w:t xml:space="preserve"> </w:t>
+      </w:r>
+      <w:r>
+        <w:rPr>
+          <w:rFonts w:ascii="Montserrat Medium" w:hAnsi="Montserrat Medium"/>
+          <w:i/>
+          <w:iCs/>
+        </w:rPr>
+        <w:t>XML arguments for embed[.]</w:t>
+      </w:r>
+      <w:proofErr w:type="spellStart"/>
+      <w:r>
+        <w:rPr>
+          <w:rFonts w:ascii="Montserrat Medium" w:hAnsi="Montserrat Medium"/>
+          <w:i/>
+          <w:iCs/>
+        </w:rPr>
+        <w:t>vbs</w:t>
+      </w:r>
+      <w:proofErr w:type="spellEnd"/>
+      <w:r>
+        <w:rPr>
+          <w:rFonts w:ascii="Montserrat Medium" w:hAnsi="Montserrat Medium"/>
+          <w:i/>
+          <w:iCs/>
+        </w:rPr>
+        <w:t xml:space="preserve"> to </w:t>
       </w:r>
       <w:r>
         <w:rPr>
@@ -8974,13 +9302,23 @@
           <w:iCs/>
         </w:rPr>
       </w:pPr>
+      <w:proofErr w:type="gramStart"/>
       <w:r>
         <w:rPr>
           <w:rFonts w:ascii="Montserrat Medium" w:hAnsi="Montserrat Medium"/>
           <w:i/>
           <w:iCs/>
         </w:rPr>
-        <w:t xml:space="preserve">Figure : Ncat </w:t>
+        <w:t>Figure :</w:t>
+      </w:r>
+      <w:proofErr w:type="gramEnd"/>
+      <w:r>
+        <w:rPr>
+          <w:rFonts w:ascii="Montserrat Medium" w:hAnsi="Montserrat Medium"/>
+          <w:i/>
+          <w:iCs/>
+        </w:rPr>
+        <w:t xml:space="preserve"> Ncat </w:t>
       </w:r>
       <w:r>
         <w:rPr>
@@ -9097,11 +9435,19 @@
           <w:rFonts w:ascii="Montserrat Medium" w:hAnsi="Montserrat Medium"/>
         </w:rPr>
       </w:pPr>
-      <w:r>
-        <w:rPr>
-          <w:rFonts w:ascii="Montserrat Medium" w:hAnsi="Montserrat Medium"/>
-        </w:rPr>
-        <w:t xml:space="preserve">Figure : </w:t>
+      <w:proofErr w:type="gramStart"/>
+      <w:r>
+        <w:rPr>
+          <w:rFonts w:ascii="Montserrat Medium" w:hAnsi="Montserrat Medium"/>
+        </w:rPr>
+        <w:t>Figure :</w:t>
+      </w:r>
+      <w:proofErr w:type="gramEnd"/>
+      <w:r>
+        <w:rPr>
+          <w:rFonts w:ascii="Montserrat Medium" w:hAnsi="Montserrat Medium"/>
+        </w:rPr>
+        <w:t xml:space="preserve"> </w:t>
       </w:r>
       <w:r>
         <w:rPr>
@@ -9160,7 +9506,21 @@
         <w:rPr>
           <w:rFonts w:ascii="Montserrat Medium" w:hAnsi="Montserrat Medium"/>
         </w:rPr>
-        <w:t xml:space="preserve">message portion in this HTTP POST </w:t>
+        <w:t xml:space="preserve">message portion in this HTTP </w:t>
+      </w:r>
+      <w:proofErr w:type="gramStart"/>
+      <w:r>
+        <w:rPr>
+          <w:rFonts w:ascii="Montserrat Medium" w:hAnsi="Montserrat Medium"/>
+        </w:rPr>
+        <w:t>POST</w:t>
+      </w:r>
+      <w:proofErr w:type="gramEnd"/>
+      <w:r>
+        <w:rPr>
+          <w:rFonts w:ascii="Montserrat Medium" w:hAnsi="Montserrat Medium"/>
+        </w:rPr>
+        <w:t xml:space="preserve"> </w:t>
       </w:r>
       <w:r>
         <w:rPr>
@@ -9206,7 +9566,21 @@
         <w:rPr>
           <w:rFonts w:ascii="Montserrat Medium" w:hAnsi="Montserrat Medium"/>
         </w:rPr>
-        <w:t>GUID   : 4f1113988d3b14972c77</w:t>
+        <w:t xml:space="preserve">GUID </w:t>
+      </w:r>
+      <w:proofErr w:type="gramStart"/>
+      <w:r>
+        <w:rPr>
+          <w:rFonts w:ascii="Montserrat Medium" w:hAnsi="Montserrat Medium"/>
+        </w:rPr>
+        <w:t xml:space="preserve">  :</w:t>
+      </w:r>
+      <w:proofErr w:type="gramEnd"/>
+      <w:r>
+        <w:rPr>
+          <w:rFonts w:ascii="Montserrat Medium" w:hAnsi="Montserrat Medium"/>
+        </w:rPr>
+        <w:t xml:space="preserve"> 4f1113988d3b14972c77</w:t>
       </w:r>
     </w:p>
     <w:p>
@@ -9216,11 +9590,19 @@
           <w:rFonts w:ascii="Montserrat Medium" w:hAnsi="Montserrat Medium"/>
         </w:rPr>
       </w:pPr>
-      <w:r>
-        <w:rPr>
-          <w:rFonts w:ascii="Montserrat Medium" w:hAnsi="Montserrat Medium"/>
-        </w:rPr>
-        <w:t>Opcode : 0x154615aa</w:t>
+      <w:proofErr w:type="gramStart"/>
+      <w:r>
+        <w:rPr>
+          <w:rFonts w:ascii="Montserrat Medium" w:hAnsi="Montserrat Medium"/>
+        </w:rPr>
+        <w:t>Opcode :</w:t>
+      </w:r>
+      <w:proofErr w:type="gramEnd"/>
+      <w:r>
+        <w:rPr>
+          <w:rFonts w:ascii="Montserrat Medium" w:hAnsi="Montserrat Medium"/>
+        </w:rPr>
+        <w:t xml:space="preserve"> 0x154615aa</w:t>
       </w:r>
     </w:p>
     <w:p>
@@ -9248,7 +9630,21 @@
         <w:rPr>
           <w:rFonts w:ascii="Montserrat Medium" w:hAnsi="Montserrat Medium"/>
         </w:rPr>
-        <w:t>Beacon ID   : 0x8938d318 (2302202648)</w:t>
+        <w:t xml:space="preserve">Beacon ID </w:t>
+      </w:r>
+      <w:proofErr w:type="gramStart"/>
+      <w:r>
+        <w:rPr>
+          <w:rFonts w:ascii="Montserrat Medium" w:hAnsi="Montserrat Medium"/>
+        </w:rPr>
+        <w:t xml:space="preserve">  :</w:t>
+      </w:r>
+      <w:proofErr w:type="gramEnd"/>
+      <w:r>
+        <w:rPr>
+          <w:rFonts w:ascii="Montserrat Medium" w:hAnsi="Montserrat Medium"/>
+        </w:rPr>
+        <w:t xml:space="preserve"> 0x8938d318 (2302202648)</w:t>
       </w:r>
     </w:p>
     <w:p>
@@ -9262,7 +9658,21 @@
         <w:rPr>
           <w:rFonts w:ascii="Montserrat Medium" w:hAnsi="Montserrat Medium"/>
         </w:rPr>
-        <w:t>Uptime low  : 0x38a4de1c (950328860)</w:t>
+        <w:t xml:space="preserve">Uptime </w:t>
+      </w:r>
+      <w:proofErr w:type="gramStart"/>
+      <w:r>
+        <w:rPr>
+          <w:rFonts w:ascii="Montserrat Medium" w:hAnsi="Montserrat Medium"/>
+        </w:rPr>
+        <w:t>low  :</w:t>
+      </w:r>
+      <w:proofErr w:type="gramEnd"/>
+      <w:r>
+        <w:rPr>
+          <w:rFonts w:ascii="Montserrat Medium" w:hAnsi="Montserrat Medium"/>
+        </w:rPr>
+        <w:t xml:space="preserve"> 0x38a4de1c (950328860)</w:t>
       </w:r>
     </w:p>
     <w:p>
@@ -9276,7 +9686,21 @@
         <w:rPr>
           <w:rFonts w:ascii="Montserrat Medium" w:hAnsi="Montserrat Medium"/>
         </w:rPr>
-        <w:t>Uptime high : 0xdd007378 (3707794296)</w:t>
+        <w:t xml:space="preserve">Uptime </w:t>
+      </w:r>
+      <w:proofErr w:type="gramStart"/>
+      <w:r>
+        <w:rPr>
+          <w:rFonts w:ascii="Montserrat Medium" w:hAnsi="Montserrat Medium"/>
+        </w:rPr>
+        <w:t>high :</w:t>
+      </w:r>
+      <w:proofErr w:type="gramEnd"/>
+      <w:r>
+        <w:rPr>
+          <w:rFonts w:ascii="Montserrat Medium" w:hAnsi="Montserrat Medium"/>
+        </w:rPr>
+        <w:t xml:space="preserve"> 0xdd007378 (3707794296)</w:t>
       </w:r>
     </w:p>
     <w:p>
@@ -9290,7 +9714,21 @@
         <w:rPr>
           <w:rFonts w:ascii="Montserrat Medium" w:hAnsi="Montserrat Medium"/>
         </w:rPr>
-        <w:t>Flags       : 0x5d30d302 (1563480834)</w:t>
+        <w:t xml:space="preserve">Flags     </w:t>
+      </w:r>
+      <w:proofErr w:type="gramStart"/>
+      <w:r>
+        <w:rPr>
+          <w:rFonts w:ascii="Montserrat Medium" w:hAnsi="Montserrat Medium"/>
+        </w:rPr>
+        <w:t xml:space="preserve">  :</w:t>
+      </w:r>
+      <w:proofErr w:type="gramEnd"/>
+      <w:r>
+        <w:rPr>
+          <w:rFonts w:ascii="Montserrat Medium" w:hAnsi="Montserrat Medium"/>
+        </w:rPr>
+        <w:t xml:space="preserve"> 0x5d30d302 (1563480834)</w:t>
       </w:r>
     </w:p>
     <w:p>
@@ -9304,7 +9742,21 @@
         <w:rPr>
           <w:rFonts w:ascii="Montserrat Medium" w:hAnsi="Montserrat Medium"/>
         </w:rPr>
-        <w:t>OS version  : 0x0d221e46 (220339782)</w:t>
+        <w:t xml:space="preserve">OS </w:t>
+      </w:r>
+      <w:proofErr w:type="gramStart"/>
+      <w:r>
+        <w:rPr>
+          <w:rFonts w:ascii="Montserrat Medium" w:hAnsi="Montserrat Medium"/>
+        </w:rPr>
+        <w:t>version  :</w:t>
+      </w:r>
+      <w:proofErr w:type="gramEnd"/>
+      <w:r>
+        <w:rPr>
+          <w:rFonts w:ascii="Montserrat Medium" w:hAnsi="Montserrat Medium"/>
+        </w:rPr>
+        <w:t xml:space="preserve"> 0x0d221e46 (220339782)</w:t>
       </w:r>
     </w:p>
     <w:p>
@@ -9318,7 +9770,21 @@
         <w:rPr>
           <w:rFonts w:ascii="Montserrat Medium" w:hAnsi="Montserrat Medium"/>
         </w:rPr>
-        <w:t>PID         : 0x1db5043a (498402362)</w:t>
+        <w:t xml:space="preserve">PID       </w:t>
+      </w:r>
+      <w:proofErr w:type="gramStart"/>
+      <w:r>
+        <w:rPr>
+          <w:rFonts w:ascii="Montserrat Medium" w:hAnsi="Montserrat Medium"/>
+        </w:rPr>
+        <w:t xml:space="preserve">  :</w:t>
+      </w:r>
+      <w:proofErr w:type="gramEnd"/>
+      <w:r>
+        <w:rPr>
+          <w:rFonts w:ascii="Montserrat Medium" w:hAnsi="Montserrat Medium"/>
+        </w:rPr>
+        <w:t xml:space="preserve"> 0x1db5043a (498402362)</w:t>
       </w:r>
     </w:p>
     <w:p>
@@ -9332,7 +9798,21 @@
         <w:rPr>
           <w:rFonts w:ascii="Montserrat Medium" w:hAnsi="Montserrat Medium"/>
         </w:rPr>
-        <w:t>PPID        : 0xd584cc5d (3582250077)</w:t>
+        <w:t xml:space="preserve">PPID      </w:t>
+      </w:r>
+      <w:proofErr w:type="gramStart"/>
+      <w:r>
+        <w:rPr>
+          <w:rFonts w:ascii="Montserrat Medium" w:hAnsi="Montserrat Medium"/>
+        </w:rPr>
+        <w:t xml:space="preserve">  :</w:t>
+      </w:r>
+      <w:proofErr w:type="gramEnd"/>
+      <w:r>
+        <w:rPr>
+          <w:rFonts w:ascii="Montserrat Medium" w:hAnsi="Montserrat Medium"/>
+        </w:rPr>
+        <w:t xml:space="preserve"> 0xd584cc5d (3582250077)</w:t>
       </w:r>
     </w:p>
     <w:p>
@@ -9346,7 +9826,21 @@
         <w:rPr>
           <w:rFonts w:ascii="Montserrat Medium" w:hAnsi="Montserrat Medium"/>
         </w:rPr>
-        <w:t>Arch        : 0x981f4c53 (2552187987)</w:t>
+        <w:t xml:space="preserve">Arch      </w:t>
+      </w:r>
+      <w:proofErr w:type="gramStart"/>
+      <w:r>
+        <w:rPr>
+          <w:rFonts w:ascii="Montserrat Medium" w:hAnsi="Montserrat Medium"/>
+        </w:rPr>
+        <w:t xml:space="preserve">  :</w:t>
+      </w:r>
+      <w:proofErr w:type="gramEnd"/>
+      <w:r>
+        <w:rPr>
+          <w:rFonts w:ascii="Montserrat Medium" w:hAnsi="Montserrat Medium"/>
+        </w:rPr>
+        <w:t xml:space="preserve"> 0x981f4c53 (2552187987)</w:t>
       </w:r>
     </w:p>
     <w:p>
@@ -9360,7 +9854,21 @@
         <w:rPr>
           <w:rFonts w:ascii="Montserrat Medium" w:hAnsi="Montserrat Medium"/>
         </w:rPr>
-        <w:t>Privilege   : 0x8e487bff (2387115007)</w:t>
+        <w:t xml:space="preserve">Privilege </w:t>
+      </w:r>
+      <w:proofErr w:type="gramStart"/>
+      <w:r>
+        <w:rPr>
+          <w:rFonts w:ascii="Montserrat Medium" w:hAnsi="Montserrat Medium"/>
+        </w:rPr>
+        <w:t xml:space="preserve">  :</w:t>
+      </w:r>
+      <w:proofErr w:type="gramEnd"/>
+      <w:r>
+        <w:rPr>
+          <w:rFonts w:ascii="Montserrat Medium" w:hAnsi="Montserrat Medium"/>
+        </w:rPr>
+        <w:t xml:space="preserve"> 0x8e487bff (2387115007)</w:t>
       </w:r>
     </w:p>
     <w:p>
@@ -9374,7 +9882,21 @@
         <w:rPr>
           <w:rFonts w:ascii="Montserrat Medium" w:hAnsi="Montserrat Medium"/>
         </w:rPr>
-        <w:t>Net status  : 0x162a26c5 (371861189)</w:t>
+        <w:t xml:space="preserve">Net </w:t>
+      </w:r>
+      <w:proofErr w:type="gramStart"/>
+      <w:r>
+        <w:rPr>
+          <w:rFonts w:ascii="Montserrat Medium" w:hAnsi="Montserrat Medium"/>
+        </w:rPr>
+        <w:t>status  :</w:t>
+      </w:r>
+      <w:proofErr w:type="gramEnd"/>
+      <w:r>
+        <w:rPr>
+          <w:rFonts w:ascii="Montserrat Medium" w:hAnsi="Montserrat Medium"/>
+        </w:rPr>
+        <w:t xml:space="preserve"> 0x162a26c5 (371861189)</w:t>
       </w:r>
     </w:p>
     <w:p>
@@ -9388,7 +9910,21 @@
         <w:rPr>
           <w:rFonts w:ascii="Montserrat Medium" w:hAnsi="Montserrat Medium"/>
         </w:rPr>
-        <w:t>Unknown 1   : 0x30ca19da (818551258)</w:t>
+        <w:t xml:space="preserve">Unknown 1 </w:t>
+      </w:r>
+      <w:proofErr w:type="gramStart"/>
+      <w:r>
+        <w:rPr>
+          <w:rFonts w:ascii="Montserrat Medium" w:hAnsi="Montserrat Medium"/>
+        </w:rPr>
+        <w:t xml:space="preserve">  :</w:t>
+      </w:r>
+      <w:proofErr w:type="gramEnd"/>
+      <w:r>
+        <w:rPr>
+          <w:rFonts w:ascii="Montserrat Medium" w:hAnsi="Montserrat Medium"/>
+        </w:rPr>
+        <w:t xml:space="preserve"> 0x30ca19da (818551258)</w:t>
       </w:r>
     </w:p>
     <w:p>
@@ -9402,7 +9938,21 @@
         <w:rPr>
           <w:rFonts w:ascii="Montserrat Medium" w:hAnsi="Montserrat Medium"/>
         </w:rPr>
-        <w:t>Unknown 2   : 0x3c6764c9 (1013408969)</w:t>
+        <w:t xml:space="preserve">Unknown 2 </w:t>
+      </w:r>
+      <w:proofErr w:type="gramStart"/>
+      <w:r>
+        <w:rPr>
+          <w:rFonts w:ascii="Montserrat Medium" w:hAnsi="Montserrat Medium"/>
+        </w:rPr>
+        <w:t xml:space="preserve">  :</w:t>
+      </w:r>
+      <w:proofErr w:type="gramEnd"/>
+      <w:r>
+        <w:rPr>
+          <w:rFonts w:ascii="Montserrat Medium" w:hAnsi="Montserrat Medium"/>
+        </w:rPr>
+        <w:t xml:space="preserve"> 0x3c6764c9 (1013408969)</w:t>
       </w:r>
     </w:p>
     <w:p>
@@ -9416,7 +9966,21 @@
         <w:rPr>
           <w:rFonts w:ascii="Montserrat Medium" w:hAnsi="Montserrat Medium"/>
         </w:rPr>
-        <w:t>Checksum    : 0x00005a13 (23059)</w:t>
+        <w:t xml:space="preserve">Checksum  </w:t>
+      </w:r>
+      <w:proofErr w:type="gramStart"/>
+      <w:r>
+        <w:rPr>
+          <w:rFonts w:ascii="Montserrat Medium" w:hAnsi="Montserrat Medium"/>
+        </w:rPr>
+        <w:t xml:space="preserve">  :</w:t>
+      </w:r>
+      <w:proofErr w:type="gramEnd"/>
+      <w:r>
+        <w:rPr>
+          <w:rFonts w:ascii="Montserrat Medium" w:hAnsi="Montserrat Medium"/>
+        </w:rPr>
+        <w:t xml:space="preserve"> 0x00005a13 (23059)</w:t>
       </w:r>
     </w:p>
     <w:p>
@@ -9574,6 +10138,7 @@
           <w:rFonts w:ascii="Montserrat Medium" w:hAnsi="Montserrat Medium"/>
         </w:rPr>
       </w:pPr>
+      <w:proofErr w:type="gramStart"/>
       <w:r>
         <w:rPr>
           <w:rFonts w:ascii="Montserrat Medium" w:hAnsi="Montserrat Medium"/>
@@ -9590,13 +10155,14 @@
         <w:rPr>
           <w:rFonts w:ascii="Montserrat Medium" w:hAnsi="Montserrat Medium"/>
         </w:rPr>
-        <w:t xml:space="preserve">: </w:t>
-      </w:r>
-      <w:r>
-        <w:rPr>
-          <w:rFonts w:ascii="Montserrat Medium" w:hAnsi="Montserrat Medium"/>
-        </w:rPr>
-        <w:t>The implant issues an HTTP GET request to the /stream endpoint with a custom authorization token and session identifier.</w:t>
+        <w:t>:</w:t>
+      </w:r>
+      <w:proofErr w:type="gramEnd"/>
+      <w:r>
+        <w:rPr>
+          <w:rFonts w:ascii="Montserrat Medium" w:hAnsi="Montserrat Medium"/>
+        </w:rPr>
+        <w:t xml:space="preserve"> The implant issues an HTTP GET request to the /stream endpoint with a custom authorization token and session identifier.</w:t>
       </w:r>
     </w:p>
     <w:p>
@@ -9616,6 +10182,7 @@
       <w:r>
         <w:rPr>
           <w:rFonts w:ascii="Montserrat Medium" w:hAnsi="Montserrat Medium"/>
+          <w:noProof/>
         </w:rPr>
         <w:drawing>
           <wp:inline distT="0" distB="0" distL="0" distR="0" wp14:anchorId="559DE265" wp14:editId="250318C8">
@@ -9686,7 +10253,21 @@
         <w:rPr>
           <w:rFonts w:ascii="Montserrat Medium" w:hAnsi="Montserrat Medium"/>
         </w:rPr>
-        <w:t>Figure X. HTTP-based beacon request captured on the loopback interface while emulating a C2 server using ncat. All network indicators have been defanged.</w:t>
+        <w:t xml:space="preserve">Figure X. HTTP-based beacon request captured on the loopback interface while emulating a C2 server using </w:t>
+      </w:r>
+      <w:proofErr w:type="spellStart"/>
+      <w:r>
+        <w:rPr>
+          <w:rFonts w:ascii="Montserrat Medium" w:hAnsi="Montserrat Medium"/>
+        </w:rPr>
+        <w:t>ncat</w:t>
+      </w:r>
+      <w:proofErr w:type="spellEnd"/>
+      <w:r>
+        <w:rPr>
+          <w:rFonts w:ascii="Montserrat Medium" w:hAnsi="Montserrat Medium"/>
+        </w:rPr>
+        <w:t>. All network indicators have been defanged.</w:t>
       </w:r>
     </w:p>
     <w:p>
@@ -9721,7 +10302,21 @@
               <w:rPr>
                 <w:rFonts w:ascii="Montserrat Medium" w:hAnsi="Montserrat Medium"/>
               </w:rPr>
-              <w:t>Frame 20: 372 bytes on wire (2976 bits), 372 bytes captured (2976 bits) on interface \Device\NPF_Loopback, id 0</w:t>
+              <w:t>Frame 20: 372 bytes on wire (2976 bits), 372 bytes captured (2976 bits) on interface \Device\</w:t>
+            </w:r>
+            <w:proofErr w:type="spellStart"/>
+            <w:r>
+              <w:rPr>
+                <w:rFonts w:ascii="Montserrat Medium" w:hAnsi="Montserrat Medium"/>
+              </w:rPr>
+              <w:t>NPF_Loopback</w:t>
+            </w:r>
+            <w:proofErr w:type="spellEnd"/>
+            <w:r>
+              <w:rPr>
+                <w:rFonts w:ascii="Montserrat Medium" w:hAnsi="Montserrat Medium"/>
+              </w:rPr>
+              <w:t>, id 0</w:t>
             </w:r>
           </w:p>
         </w:tc>
@@ -9761,7 +10356,63 @@
               <w:rPr>
                 <w:rFonts w:ascii="Montserrat Medium" w:hAnsi="Montserrat Medium"/>
               </w:rPr>
-              <w:t>Internet Protocol Version 4, Src: 127[.]0[.]0[.]1, Dst: 127[.]0[.]0[.]1</w:t>
+              <w:t xml:space="preserve">Internet Protocol Version 4, </w:t>
+            </w:r>
+            <w:proofErr w:type="spellStart"/>
+            <w:r>
+              <w:rPr>
+                <w:rFonts w:ascii="Montserrat Medium" w:hAnsi="Montserrat Medium"/>
+              </w:rPr>
+              <w:t>Src</w:t>
+            </w:r>
+            <w:proofErr w:type="spellEnd"/>
+            <w:r>
+              <w:rPr>
+                <w:rFonts w:ascii="Montserrat Medium" w:hAnsi="Montserrat Medium"/>
+              </w:rPr>
+              <w:t xml:space="preserve">: </w:t>
+            </w:r>
+            <w:proofErr w:type="gramStart"/>
+            <w:r>
+              <w:rPr>
+                <w:rFonts w:ascii="Montserrat Medium" w:hAnsi="Montserrat Medium"/>
+              </w:rPr>
+              <w:t>127[.]0</w:t>
+            </w:r>
+            <w:proofErr w:type="gramEnd"/>
+            <w:r>
+              <w:rPr>
+                <w:rFonts w:ascii="Montserrat Medium" w:hAnsi="Montserrat Medium"/>
+              </w:rPr>
+              <w:t xml:space="preserve">[.]0[.]1, </w:t>
+            </w:r>
+            <w:proofErr w:type="spellStart"/>
+            <w:r>
+              <w:rPr>
+                <w:rFonts w:ascii="Montserrat Medium" w:hAnsi="Montserrat Medium"/>
+              </w:rPr>
+              <w:t>Dst</w:t>
+            </w:r>
+            <w:proofErr w:type="spellEnd"/>
+            <w:r>
+              <w:rPr>
+                <w:rFonts w:ascii="Montserrat Medium" w:hAnsi="Montserrat Medium"/>
+              </w:rPr>
+              <w:t>: 127[.]0[.</w:t>
+            </w:r>
+            <w:proofErr w:type="gramStart"/>
+            <w:r>
+              <w:rPr>
+                <w:rFonts w:ascii="Montserrat Medium" w:hAnsi="Montserrat Medium"/>
+              </w:rPr>
+              <w:t>]0</w:t>
+            </w:r>
+            <w:proofErr w:type="gramEnd"/>
+            <w:r>
+              <w:rPr>
+                <w:rFonts w:ascii="Montserrat Medium" w:hAnsi="Montserrat Medium"/>
+              </w:rPr>
+              <w:t>[.]1</w:t>
             </w:r>
           </w:p>
         </w:tc>
@@ -9781,7 +10432,35 @@
               <w:rPr>
                 <w:rFonts w:ascii="Montserrat Medium" w:hAnsi="Montserrat Medium"/>
               </w:rPr>
-              <w:t>Transmission Control Protocol, Src Port: 50140, Dst Port: 5133, Seq: 1, Ack: 1, Len: 328</w:t>
+              <w:t xml:space="preserve">Transmission Control Protocol, </w:t>
+            </w:r>
+            <w:proofErr w:type="spellStart"/>
+            <w:r>
+              <w:rPr>
+                <w:rFonts w:ascii="Montserrat Medium" w:hAnsi="Montserrat Medium"/>
+              </w:rPr>
+              <w:t>Src</w:t>
+            </w:r>
+            <w:proofErr w:type="spellEnd"/>
+            <w:r>
+              <w:rPr>
+                <w:rFonts w:ascii="Montserrat Medium" w:hAnsi="Montserrat Medium"/>
+              </w:rPr>
+              <w:t xml:space="preserve"> Port: 50140, </w:t>
+            </w:r>
+            <w:proofErr w:type="spellStart"/>
+            <w:r>
+              <w:rPr>
+                <w:rFonts w:ascii="Montserrat Medium" w:hAnsi="Montserrat Medium"/>
+              </w:rPr>
+              <w:t>Dst</w:t>
+            </w:r>
+            <w:proofErr w:type="spellEnd"/>
+            <w:r>
+              <w:rPr>
+                <w:rFonts w:ascii="Montserrat Medium" w:hAnsi="Montserrat Medium"/>
+              </w:rPr>
+              <w:t xml:space="preserve"> Port: 5133, Seq: 1, Ack: 1, Len: 328</w:t>
             </w:r>
           </w:p>
         </w:tc>
@@ -9921,7 +10600,21 @@
               <w:rPr>
                 <w:rFonts w:ascii="Montserrat Medium" w:hAnsi="Montserrat Medium"/>
               </w:rPr>
-              <w:t xml:space="preserve">    Sequence Number: 1    (relative sequence number)</w:t>
+              <w:t xml:space="preserve">    Sequence Number: 1 </w:t>
+            </w:r>
+            <w:proofErr w:type="gramStart"/>
+            <w:r>
+              <w:rPr>
+                <w:rFonts w:ascii="Montserrat Medium" w:hAnsi="Montserrat Medium"/>
+              </w:rPr>
+              <w:t xml:space="preserve">   (</w:t>
+            </w:r>
+            <w:proofErr w:type="gramEnd"/>
+            <w:r>
+              <w:rPr>
+                <w:rFonts w:ascii="Montserrat Medium" w:hAnsi="Montserrat Medium"/>
+              </w:rPr>
+              <w:t>relative sequence number)</w:t>
             </w:r>
           </w:p>
         </w:tc>
@@ -9961,7 +10654,21 @@
               <w:rPr>
                 <w:rFonts w:ascii="Montserrat Medium" w:hAnsi="Montserrat Medium"/>
               </w:rPr>
-              <w:t xml:space="preserve">    [Next Sequence Number: 329    (relative sequence number)]</w:t>
+              <w:t xml:space="preserve">    [Next Sequence Number: 329 </w:t>
+            </w:r>
+            <w:proofErr w:type="gramStart"/>
+            <w:r>
+              <w:rPr>
+                <w:rFonts w:ascii="Montserrat Medium" w:hAnsi="Montserrat Medium"/>
+              </w:rPr>
+              <w:t xml:space="preserve">   (</w:t>
+            </w:r>
+            <w:proofErr w:type="gramEnd"/>
+            <w:r>
+              <w:rPr>
+                <w:rFonts w:ascii="Montserrat Medium" w:hAnsi="Montserrat Medium"/>
+              </w:rPr>
+              <w:t>relative sequence number)]</w:t>
             </w:r>
           </w:p>
         </w:tc>
@@ -9981,7 +10688,21 @@
               <w:rPr>
                 <w:rFonts w:ascii="Montserrat Medium" w:hAnsi="Montserrat Medium"/>
               </w:rPr>
-              <w:t xml:space="preserve">    Acknowledgment Number: 1    (relative ack number)</w:t>
+              <w:t xml:space="preserve">    Acknowledgment Number: 1 </w:t>
+            </w:r>
+            <w:proofErr w:type="gramStart"/>
+            <w:r>
+              <w:rPr>
+                <w:rFonts w:ascii="Montserrat Medium" w:hAnsi="Montserrat Medium"/>
+              </w:rPr>
+              <w:t xml:space="preserve">   (</w:t>
+            </w:r>
+            <w:proofErr w:type="gramEnd"/>
+            <w:r>
+              <w:rPr>
+                <w:rFonts w:ascii="Montserrat Medium" w:hAnsi="Montserrat Medium"/>
+              </w:rPr>
+              <w:t>relative ack number)</w:t>
             </w:r>
           </w:p>
         </w:tc>
@@ -10421,7 +11142,21 @@
               <w:rPr>
                 <w:rFonts w:ascii="Montserrat Medium" w:hAnsi="Montserrat Medium"/>
               </w:rPr>
-              <w:t xml:space="preserve">    Mcp-Session-Id: 0f6090c6d9b9f4ed8a2cd47ec7c92339c1267245\r\n</w:t>
+              <w:t xml:space="preserve">    </w:t>
+            </w:r>
+            <w:proofErr w:type="spellStart"/>
+            <w:r>
+              <w:rPr>
+                <w:rFonts w:ascii="Montserrat Medium" w:hAnsi="Montserrat Medium"/>
+              </w:rPr>
+              <w:t>Mcp</w:t>
+            </w:r>
+            <w:proofErr w:type="spellEnd"/>
+            <w:r>
+              <w:rPr>
+                <w:rFonts w:ascii="Montserrat Medium" w:hAnsi="Montserrat Medium"/>
+              </w:rPr>
+              <w:t>-Session-Id: 0f6090c6d9b9f4ed8a2cd47ec7c92339c1267245\r\n</w:t>
             </w:r>
           </w:p>
         </w:tc>
@@ -10461,7 +11196,21 @@
               <w:rPr>
                 <w:rFonts w:ascii="Montserrat Medium" w:hAnsi="Montserrat Medium"/>
               </w:rPr>
-              <w:t xml:space="preserve">    sec-fetch-mode: cors\r\n</w:t>
+              <w:t xml:space="preserve">    sec-fetch-mode: </w:t>
+            </w:r>
+            <w:proofErr w:type="spellStart"/>
+            <w:r>
+              <w:rPr>
+                <w:rFonts w:ascii="Montserrat Medium" w:hAnsi="Montserrat Medium"/>
+              </w:rPr>
+              <w:t>cors</w:t>
+            </w:r>
+            <w:proofErr w:type="spellEnd"/>
+            <w:r>
+              <w:rPr>
+                <w:rFonts w:ascii="Montserrat Medium" w:hAnsi="Montserrat Medium"/>
+              </w:rPr>
+              <w:t>\r\n</w:t>
             </w:r>
           </w:p>
         </w:tc>
@@ -10501,7 +11250,21 @@
               <w:rPr>
                 <w:rFonts w:ascii="Montserrat Medium" w:hAnsi="Montserrat Medium"/>
               </w:rPr>
-              <w:t xml:space="preserve">    accept-encoding: gzip, deflate\r\n</w:t>
+              <w:t xml:space="preserve">    accept-encoding: </w:t>
+            </w:r>
+            <w:proofErr w:type="spellStart"/>
+            <w:r>
+              <w:rPr>
+                <w:rFonts w:ascii="Montserrat Medium" w:hAnsi="Montserrat Medium"/>
+              </w:rPr>
+              <w:t>gzip</w:t>
+            </w:r>
+            <w:proofErr w:type="spellEnd"/>
+            <w:r>
+              <w:rPr>
+                <w:rFonts w:ascii="Montserrat Medium" w:hAnsi="Montserrat Medium"/>
+              </w:rPr>
+              <w:t>, deflate\r\n</w:t>
             </w:r>
           </w:p>
         </w:tc>
@@ -10951,6 +11714,7 @@
           <w:szCs w:val="24"/>
         </w:rPr>
       </w:pPr>
+      <w:proofErr w:type="gramStart"/>
       <w:r>
         <w:rPr>
           <w:rFonts w:ascii="Montserrat Medium" w:hAnsi="Montserrat Medium"/>
@@ -10958,7 +11722,17 @@
           <w:iCs/>
           <w:szCs w:val="24"/>
         </w:rPr>
-        <w:t>Figure : Hardcoded password and AES decryption of a base64 string</w:t>
+        <w:t>Figure :</w:t>
+      </w:r>
+      <w:proofErr w:type="gramEnd"/>
+      <w:r>
+        <w:rPr>
+          <w:rFonts w:ascii="Montserrat Medium" w:hAnsi="Montserrat Medium"/>
+          <w:i/>
+          <w:iCs/>
+          <w:szCs w:val="24"/>
+        </w:rPr>
+        <w:t xml:space="preserve"> Hardcoded password and AES decryption of a base64 string</w:t>
       </w:r>
     </w:p>
     <w:p>
@@ -11046,6 +11820,7 @@
           <w:szCs w:val="24"/>
         </w:rPr>
       </w:pPr>
+      <w:proofErr w:type="gramStart"/>
       <w:r>
         <w:rPr>
           <w:rFonts w:ascii="Montserrat Medium" w:hAnsi="Montserrat Medium"/>
@@ -11053,7 +11828,17 @@
           <w:iCs/>
           <w:szCs w:val="24"/>
         </w:rPr>
-        <w:t>Figure : AES encryption function</w:t>
+        <w:t>Figure :</w:t>
+      </w:r>
+      <w:proofErr w:type="gramEnd"/>
+      <w:r>
+        <w:rPr>
+          <w:rFonts w:ascii="Montserrat Medium" w:hAnsi="Montserrat Medium"/>
+          <w:i/>
+          <w:iCs/>
+          <w:szCs w:val="24"/>
+        </w:rPr>
+        <w:t xml:space="preserve"> AES encryption function</w:t>
       </w:r>
     </w:p>
     <w:p>
@@ -11137,6 +11922,7 @@
           <w:szCs w:val="24"/>
         </w:rPr>
       </w:pPr>
+      <w:proofErr w:type="gramStart"/>
       <w:r>
         <w:rPr>
           <w:rFonts w:ascii="Montserrat Medium" w:hAnsi="Montserrat Medium"/>
@@ -11144,7 +11930,17 @@
           <w:iCs/>
           <w:szCs w:val="24"/>
         </w:rPr>
-        <w:t>Figure : Name and location of dropped VBS script and XML file to be loaded at user logon</w:t>
+        <w:t>Figure :</w:t>
+      </w:r>
+      <w:proofErr w:type="gramEnd"/>
+      <w:r>
+        <w:rPr>
+          <w:rFonts w:ascii="Montserrat Medium" w:hAnsi="Montserrat Medium"/>
+          <w:i/>
+          <w:iCs/>
+          <w:szCs w:val="24"/>
+        </w:rPr>
+        <w:t xml:space="preserve"> Name and location of dropped VBS script and XML file to be loaded at user logon</w:t>
       </w:r>
     </w:p>
     <w:p>
@@ -11460,22 +12256,6 @@
           <w:rFonts w:ascii="Montserrat Medium" w:hAnsi="Montserrat Medium"/>
         </w:rPr>
       </w:pPr>
-    </w:p>
-    <w:p>
-      <w:pPr>
-        <w:pStyle w:val="Heading2"/>
-        <w:rPr>
-          <w:sz w:val="28"/>
-          <w:szCs w:val="28"/>
-        </w:rPr>
-      </w:pPr>
-      <w:r>
-        <w:rPr>
-          <w:sz w:val="28"/>
-          <w:szCs w:val="28"/>
-        </w:rPr>
-        <w:t>Stage 4: Final Covenant Implant</w:t>
-      </w:r>
     </w:p>
     <w:p>
       <w:pPr>
@@ -12826,8 +13606,18 @@
           <w:i/>
           <w:iCs/>
         </w:rPr>
-        <w:t>Fig 4:.</w:t>
-      </w:r>
+        <w:t xml:space="preserve">Fig </w:t>
+      </w:r>
+      <w:proofErr w:type="gramStart"/>
+      <w:r>
+        <w:rPr>
+          <w:rFonts w:ascii="Montserrat Medium" w:hAnsi="Montserrat Medium"/>
+          <w:i/>
+          <w:iCs/>
+        </w:rPr>
+        <w:t>4:.</w:t>
+      </w:r>
+      <w:proofErr w:type="gramEnd"/>
     </w:p>
     <w:p>
       <w:pPr>
@@ -13124,7 +13914,21 @@
               <w:rPr>
                 <w:rFonts w:ascii="Montserrat Medium" w:hAnsi="Montserrat Medium"/>
               </w:rPr>
-              <w:t>/en-us/index[.]html</w:t>
+              <w:t>/</w:t>
+            </w:r>
+            <w:proofErr w:type="gramStart"/>
+            <w:r>
+              <w:rPr>
+                <w:rFonts w:ascii="Montserrat Medium" w:hAnsi="Montserrat Medium"/>
+              </w:rPr>
+              <w:t>en</w:t>
+            </w:r>
+            <w:proofErr w:type="gramEnd"/>
+            <w:r>
+              <w:rPr>
+                <w:rFonts w:ascii="Montserrat Medium" w:hAnsi="Montserrat Medium"/>
+              </w:rPr>
+              <w:t>-us/index[.]html</w:t>
             </w:r>
           </w:p>
         </w:tc>
@@ -13202,7 +14006,21 @@
               <w:rPr>
                 <w:rFonts w:ascii="Montserrat Medium" w:hAnsi="Montserrat Medium"/>
               </w:rPr>
-              <w:t>/en-us/docs[.]html</w:t>
+              <w:t>/</w:t>
+            </w:r>
+            <w:proofErr w:type="gramStart"/>
+            <w:r>
+              <w:rPr>
+                <w:rFonts w:ascii="Montserrat Medium" w:hAnsi="Montserrat Medium"/>
+              </w:rPr>
+              <w:t>en</w:t>
+            </w:r>
+            <w:proofErr w:type="gramEnd"/>
+            <w:r>
+              <w:rPr>
+                <w:rFonts w:ascii="Montserrat Medium" w:hAnsi="Montserrat Medium"/>
+              </w:rPr>
+              <w:t>-us/docs[.]html</w:t>
             </w:r>
           </w:p>
         </w:tc>
@@ -13280,7 +14098,21 @@
               <w:rPr>
                 <w:rFonts w:ascii="Montserrat Medium" w:hAnsi="Montserrat Medium"/>
               </w:rPr>
-              <w:t>/en-us/test[.]html</w:t>
+              <w:t>/</w:t>
+            </w:r>
+            <w:proofErr w:type="gramStart"/>
+            <w:r>
+              <w:rPr>
+                <w:rFonts w:ascii="Montserrat Medium" w:hAnsi="Montserrat Medium"/>
+              </w:rPr>
+              <w:t>en</w:t>
+            </w:r>
+            <w:proofErr w:type="gramEnd"/>
+            <w:r>
+              <w:rPr>
+                <w:rFonts w:ascii="Montserrat Medium" w:hAnsi="Montserrat Medium"/>
+              </w:rPr>
+              <w:t>-us/test[.]html</w:t>
             </w:r>
           </w:p>
         </w:tc>
@@ -13358,7 +14190,21 @@
               <w:rPr>
                 <w:rFonts w:ascii="Montserrat Medium" w:hAnsi="Montserrat Medium"/>
               </w:rPr>
-              <w:t>i=a19ea23062db990386a3a478cb89d52e&amp;data={0}&amp;session=75db-99b1-25fe4e9afbe58696-320bea73</w:t>
+              <w:t>i=a19ea23062db990386a3a478cb89d52e&amp;data</w:t>
+            </w:r>
+            <w:proofErr w:type="gramStart"/>
+            <w:r>
+              <w:rPr>
+                <w:rFonts w:ascii="Montserrat Medium" w:hAnsi="Montserrat Medium"/>
+              </w:rPr>
+              <w:t>={0}&amp;</w:t>
+            </w:r>
+            <w:proofErr w:type="gramEnd"/>
+            <w:r>
+              <w:rPr>
+                <w:rFonts w:ascii="Montserrat Medium" w:hAnsi="Montserrat Medium"/>
+              </w:rPr>
+              <w:t>session=75db-99b1-25fe4e9afbe58696-320bea73</w:t>
             </w:r>
           </w:p>
         </w:tc>
@@ -13592,7 +14438,91 @@
               <w:rPr>
                 <w:rFonts w:ascii="Montserrat Medium" w:hAnsi="Montserrat Medium"/>
               </w:rPr>
-              <w:t>{"GUID":"{0}","Type":{1},"Meta":"{2}","IV":"{3}","EncryptedMessage":"{4}","HMAC":"{5}"}</w:t>
+              <w:t>{"GUID"</w:t>
+            </w:r>
+            <w:proofErr w:type="gramStart"/>
+            <w:r>
+              <w:rPr>
+                <w:rFonts w:ascii="Montserrat Medium" w:hAnsi="Montserrat Medium"/>
+              </w:rPr>
+              <w:t>:"{0}"</w:t>
+            </w:r>
+            <w:proofErr w:type="gramEnd"/>
+            <w:r>
+              <w:rPr>
+                <w:rFonts w:ascii="Montserrat Medium" w:hAnsi="Montserrat Medium"/>
+              </w:rPr>
+              <w:t>,"Type</w:t>
+            </w:r>
+            <w:proofErr w:type="gramStart"/>
+            <w:r>
+              <w:rPr>
+                <w:rFonts w:ascii="Montserrat Medium" w:hAnsi="Montserrat Medium"/>
+              </w:rPr>
+              <w:t>":{1},</w:t>
+            </w:r>
+            <w:proofErr w:type="gramEnd"/>
+            <w:r>
+              <w:rPr>
+                <w:rFonts w:ascii="Montserrat Medium" w:hAnsi="Montserrat Medium"/>
+              </w:rPr>
+              <w:t>"Meta"</w:t>
+            </w:r>
+            <w:proofErr w:type="gramStart"/>
+            <w:r>
+              <w:rPr>
+                <w:rFonts w:ascii="Montserrat Medium" w:hAnsi="Montserrat Medium"/>
+              </w:rPr>
+              <w:t>:"{2}"</w:t>
+            </w:r>
+            <w:proofErr w:type="gramEnd"/>
+            <w:r>
+              <w:rPr>
+                <w:rFonts w:ascii="Montserrat Medium" w:hAnsi="Montserrat Medium"/>
+              </w:rPr>
+              <w:t>,"</w:t>
+            </w:r>
+            <w:proofErr w:type="gramStart"/>
+            <w:r>
+              <w:rPr>
+                <w:rFonts w:ascii="Montserrat Medium" w:hAnsi="Montserrat Medium"/>
+              </w:rPr>
+              <w:t>IV":"{3}"</w:t>
+            </w:r>
+            <w:proofErr w:type="gramEnd"/>
+            <w:r>
+              <w:rPr>
+                <w:rFonts w:ascii="Montserrat Medium" w:hAnsi="Montserrat Medium"/>
+              </w:rPr>
+              <w:t>,"EncryptedMessage"</w:t>
+            </w:r>
+            <w:proofErr w:type="gramStart"/>
+            <w:r>
+              <w:rPr>
+                <w:rFonts w:ascii="Montserrat Medium" w:hAnsi="Montserrat Medium"/>
+              </w:rPr>
+              <w:t>:"{4}"</w:t>
+            </w:r>
+            <w:proofErr w:type="gramEnd"/>
+            <w:r>
+              <w:rPr>
+                <w:rFonts w:ascii="Montserrat Medium" w:hAnsi="Montserrat Medium"/>
+              </w:rPr>
+              <w:t>,"HMAC"</w:t>
+            </w:r>
+            <w:proofErr w:type="gramStart"/>
+            <w:r>
+              <w:rPr>
+                <w:rFonts w:ascii="Montserrat Medium" w:hAnsi="Montserrat Medium"/>
+              </w:rPr>
+              <w:t>:"{</w:t>
+            </w:r>
+            <w:proofErr w:type="gramEnd"/>
+            <w:r>
+              <w:rPr>
+                <w:rFonts w:ascii="Montserrat Medium" w:hAnsi="Montserrat Medium"/>
+              </w:rPr>
+              <w:t>5}"}</w:t>
             </w:r>
           </w:p>
         </w:tc>
@@ -14254,7 +15184,21 @@
               <w:rPr>
                 <w:rFonts w:ascii="Montserrat Medium" w:hAnsi="Montserrat Medium"/>
               </w:rPr>
-              <w:t>Pinned certificate hash associated with Covenant framework</w:t>
+              <w:t xml:space="preserve">Pinned certificate </w:t>
+            </w:r>
+            <w:proofErr w:type="gramStart"/>
+            <w:r>
+              <w:rPr>
+                <w:rFonts w:ascii="Montserrat Medium" w:hAnsi="Montserrat Medium"/>
+              </w:rPr>
+              <w:t>hash</w:t>
+            </w:r>
+            <w:proofErr w:type="gramEnd"/>
+            <w:r>
+              <w:rPr>
+                <w:rFonts w:ascii="Montserrat Medium" w:hAnsi="Montserrat Medium"/>
+              </w:rPr>
+              <w:t xml:space="preserve"> associated with Covenant framework</w:t>
             </w:r>
           </w:p>
         </w:tc>
@@ -14560,47 +15504,39 @@
     </w:p>
     <w:p>
       <w:pPr>
-        <w:pStyle w:val="Heading2"/>
-        <w:rPr>
-          <w:sz w:val="28"/>
-          <w:szCs w:val="28"/>
-        </w:rPr>
-      </w:pPr>
-      <w:r>
-        <w:rPr>
-          <w:sz w:val="28"/>
-          <w:szCs w:val="28"/>
-        </w:rPr>
-        <w:t>Stage 4: Final Covenant Implant</w:t>
-      </w:r>
-    </w:p>
-    <w:p>
-      <w:pPr>
-        <w:rPr>
-          <w:rFonts w:ascii="Montserrat Medium" w:hAnsi="Montserrat Medium"/>
-        </w:rPr>
-      </w:pPr>
-    </w:p>
-    <w:p>
-      <w:pPr>
-        <w:spacing w:after="160" w:line="259" w:lineRule="auto"/>
-        <w:rPr>
-          <w:rFonts w:ascii="Montserrat Medium" w:hAnsi="Montserrat Medium"/>
-        </w:rPr>
-      </w:pPr>
-    </w:p>
-    <w:p>
-      <w:pPr>
-        <w:spacing w:after="160" w:line="259" w:lineRule="auto"/>
-        <w:rPr>
-          <w:rFonts w:ascii="Montserrat Medium" w:hAnsi="Montserrat Medium"/>
-        </w:rPr>
-      </w:pPr>
-      <w:r>
-        <w:rPr>
-          <w:rFonts w:ascii="Montserrat Medium" w:hAnsi="Montserrat Medium"/>
-        </w:rPr>
-        <w:t>Analysis Artifacts (NOT MALICIOUS)</w:t>
+        <w:rPr>
+          <w:rFonts w:ascii="Montserrat Medium" w:hAnsi="Montserrat Medium"/>
+        </w:rPr>
+      </w:pPr>
+    </w:p>
+    <w:p>
+      <w:pPr>
+        <w:spacing w:after="160" w:line="259" w:lineRule="auto"/>
+        <w:rPr>
+          <w:rFonts w:ascii="Montserrat Medium" w:hAnsi="Montserrat Medium"/>
+        </w:rPr>
+      </w:pPr>
+    </w:p>
+    <w:p>
+      <w:pPr>
+        <w:spacing w:after="160" w:line="259" w:lineRule="auto"/>
+        <w:rPr>
+          <w:rFonts w:ascii="Montserrat Medium" w:hAnsi="Montserrat Medium"/>
+        </w:rPr>
+      </w:pPr>
+      <w:proofErr w:type="gramStart"/>
+      <w:r>
+        <w:rPr>
+          <w:rFonts w:ascii="Montserrat Medium" w:hAnsi="Montserrat Medium"/>
+        </w:rPr>
+        <w:t>Analysis</w:t>
+      </w:r>
+      <w:proofErr w:type="gramEnd"/>
+      <w:r>
+        <w:rPr>
+          <w:rFonts w:ascii="Montserrat Medium" w:hAnsi="Montserrat Medium"/>
+        </w:rPr>
+        <w:t xml:space="preserve"> Artifacts (NOT MALICIOUS)</w:t>
       </w:r>
     </w:p>
     <w:p>
@@ -14802,7 +15738,35 @@
         <w:rPr>
           <w:rFonts w:ascii="Montserrat Medium" w:hAnsi="Montserrat Medium"/>
         </w:rPr>
-        <w:t>Presence of encrypted Base64 blobs stored in .rsrc / .rsdata sections</w:t>
+        <w:t xml:space="preserve">Presence of encrypted Base64 blobs stored </w:t>
+      </w:r>
+      <w:proofErr w:type="gramStart"/>
+      <w:r>
+        <w:rPr>
+          <w:rFonts w:ascii="Montserrat Medium" w:hAnsi="Montserrat Medium"/>
+        </w:rPr>
+        <w:t>in .rsrc</w:t>
+      </w:r>
+      <w:proofErr w:type="gramEnd"/>
+      <w:r>
+        <w:rPr>
+          <w:rFonts w:ascii="Montserrat Medium" w:hAnsi="Montserrat Medium"/>
+        </w:rPr>
+        <w:t xml:space="preserve"> </w:t>
+      </w:r>
+      <w:proofErr w:type="gramStart"/>
+      <w:r>
+        <w:rPr>
+          <w:rFonts w:ascii="Montserrat Medium" w:hAnsi="Montserrat Medium"/>
+        </w:rPr>
+        <w:t>/ .rsdata</w:t>
+      </w:r>
+      <w:proofErr w:type="gramEnd"/>
+      <w:r>
+        <w:rPr>
+          <w:rFonts w:ascii="Montserrat Medium" w:hAnsi="Montserrat Medium"/>
+        </w:rPr>
+        <w:t xml:space="preserve"> sections</w:t>
       </w:r>
     </w:p>
     <w:p>
@@ -14858,7 +15822,21 @@
         <w:rPr>
           <w:rFonts w:ascii="Montserrat Medium" w:hAnsi="Montserrat Medium"/>
         </w:rPr>
-        <w:t>References to System.Reflection.Assembly::Load</w:t>
+        <w:t xml:space="preserve">References to </w:t>
+      </w:r>
+      <w:proofErr w:type="gramStart"/>
+      <w:r>
+        <w:rPr>
+          <w:rFonts w:ascii="Montserrat Medium" w:hAnsi="Montserrat Medium"/>
+        </w:rPr>
+        <w:t>System.Reflection.Assembly::</w:t>
+      </w:r>
+      <w:proofErr w:type="gramEnd"/>
+      <w:r>
+        <w:rPr>
+          <w:rFonts w:ascii="Montserrat Medium" w:hAnsi="Montserrat Medium"/>
+        </w:rPr>
+        <w:t>Load</w:t>
       </w:r>
     </w:p>
     <w:p>
@@ -15078,8 +16056,18 @@
           <w:b/>
           <w:bCs/>
         </w:rPr>
-        <w:t>Living-off-the-Land execution</w:t>
-      </w:r>
+        <w:t xml:space="preserve">Living-off-the-Land </w:t>
+      </w:r>
+      <w:proofErr w:type="gramStart"/>
+      <w:r>
+        <w:rPr>
+          <w:rFonts w:ascii="Montserrat Medium" w:hAnsi="Montserrat Medium"/>
+          <w:b/>
+          <w:bCs/>
+        </w:rPr>
+        <w:t>execution</w:t>
+      </w:r>
+      <w:proofErr w:type="gramEnd"/>
     </w:p>
     <w:p>
       <w:pPr>
@@ -16135,7 +17123,17 @@
           <w:sz w:val="21"/>
           <w:szCs w:val="21"/>
         </w:rPr>
-        <w:t xml:space="preserve"> { </w:t>
+        <w:t xml:space="preserve"> </w:t>
+      </w:r>
+      <w:proofErr w:type="gramStart"/>
+      <w:r>
+        <w:rPr>
+          <w:rFonts w:ascii="Montserrat Medium" w:eastAsia="Times New Roman" w:hAnsi="Montserrat Medium" w:cs="Times New Roman"/>
+          <w:color w:val="CCCCCC"/>
+          <w:sz w:val="21"/>
+          <w:szCs w:val="21"/>
+        </w:rPr>
+        <w:t xml:space="preserve">{ </w:t>
       </w:r>
       <w:r>
         <w:rPr>
@@ -16146,6 +17144,7 @@
         </w:rPr>
         <w:t>01</w:t>
       </w:r>
+      <w:proofErr w:type="gramEnd"/>
       <w:r>
         <w:rPr>
           <w:rFonts w:ascii="Montserrat Medium" w:eastAsia="Times New Roman" w:hAnsi="Montserrat Medium" w:cs="Times New Roman"/>
@@ -16263,6 +17262,7 @@
         </w:rPr>
         <w:t xml:space="preserve"> </w:t>
       </w:r>
+      <w:proofErr w:type="gramStart"/>
       <w:r>
         <w:rPr>
           <w:rFonts w:ascii="Montserrat Medium" w:eastAsia="Times New Roman" w:hAnsi="Montserrat Medium" w:cs="Times New Roman"/>
@@ -16281,6 +17281,7 @@
         </w:rPr>
         <w:t xml:space="preserve"> }</w:t>
       </w:r>
+      <w:proofErr w:type="gramEnd"/>
     </w:p>
     <w:p>
       <w:pPr>
@@ -16821,6 +17822,7 @@
         </w:rPr>
         <w:t>\"</w:t>
       </w:r>
+      <w:proofErr w:type="gramStart"/>
       <w:r>
         <w:rPr>
           <w:rFonts w:ascii="Montserrat Medium" w:eastAsia="Times New Roman" w:hAnsi="Montserrat Medium" w:cs="Times New Roman"/>
@@ -16839,6 +17841,7 @@
         </w:rPr>
         <w:t>\"</w:t>
       </w:r>
+      <w:proofErr w:type="gramEnd"/>
       <w:r>
         <w:rPr>
           <w:rFonts w:ascii="Montserrat Medium" w:eastAsia="Times New Roman" w:hAnsi="Montserrat Medium" w:cs="Times New Roman"/>
@@ -16932,6 +17935,7 @@
         </w:rPr>
         <w:t>\"</w:t>
       </w:r>
+      <w:proofErr w:type="gramStart"/>
       <w:r>
         <w:rPr>
           <w:rFonts w:ascii="Montserrat Medium" w:eastAsia="Times New Roman" w:hAnsi="Montserrat Medium" w:cs="Times New Roman"/>
@@ -16950,6 +17954,7 @@
         </w:rPr>
         <w:t>\"</w:t>
       </w:r>
+      <w:proofErr w:type="gramEnd"/>
       <w:r>
         <w:rPr>
           <w:rFonts w:ascii="Montserrat Medium" w:eastAsia="Times New Roman" w:hAnsi="Montserrat Medium" w:cs="Times New Roman"/>
@@ -17268,6 +18273,7 @@
         </w:rPr>
         <w:t xml:space="preserve">        </w:t>
       </w:r>
+      <w:proofErr w:type="gramStart"/>
       <w:r>
         <w:rPr>
           <w:rFonts w:ascii="Montserrat Medium" w:eastAsia="Times New Roman" w:hAnsi="Montserrat Medium" w:cs="Times New Roman"/>
@@ -17295,6 +18301,7 @@
         </w:rPr>
         <w:t>of</w:t>
       </w:r>
+      <w:proofErr w:type="gramEnd"/>
       <w:r>
         <w:rPr>
           <w:rFonts w:ascii="Montserrat Medium" w:eastAsia="Times New Roman" w:hAnsi="Montserrat Medium" w:cs="Times New Roman"/>
@@ -17738,8 +18745,16 @@
               <w:rPr>
                 <w:rFonts w:ascii="Montserrat Medium" w:hAnsi="Montserrat Medium"/>
               </w:rPr>
-              <w:t xml:space="preserve"> srv</w:t>
-            </w:r>
+              <w:t xml:space="preserve"> </w:t>
+            </w:r>
+            <w:proofErr w:type="spellStart"/>
+            <w:r>
+              <w:rPr>
+                <w:rFonts w:ascii="Montserrat Medium" w:hAnsi="Montserrat Medium"/>
+              </w:rPr>
+              <w:t>srv</w:t>
+            </w:r>
+            <w:proofErr w:type="spellEnd"/>
             <w:r>
               <w:rPr>
                 <w:rFonts w:ascii="Montserrat Medium" w:hAnsi="Montserrat Medium"/>
@@ -17758,12 +18773,14 @@
               </w:rPr>
               <w:t>]</w:t>
             </w:r>
+            <w:proofErr w:type="spellStart"/>
             <w:r>
               <w:rPr>
                 <w:rFonts w:ascii="Montserrat Medium" w:hAnsi="Montserrat Medium"/>
               </w:rPr>
               <w:t>masterchiefsgruntemporium</w:t>
             </w:r>
+            <w:proofErr w:type="spellEnd"/>
             <w:r>
               <w:rPr>
                 <w:rFonts w:ascii="Montserrat Medium" w:hAnsi="Montserrat Medium"/>
@@ -21763,6 +22780,7 @@
   <w:style w:type="character" w:default="1" w:styleId="DefaultParagraphFont">
     <w:name w:val="Default Paragraph Font"/>
     <w:uiPriority w:val="1"/>
+    <w:semiHidden/>
     <w:unhideWhenUsed/>
   </w:style>
   <w:style w:type="table" w:default="1" w:styleId="TableNormal">

</xml_diff>